<commit_message>
Updated pdf | Added additional design pattern GoF participants
</commit_message>
<xml_diff>
--- a/Practical5.docx
+++ b/Practical5.docx
@@ -10,11 +10,7 @@
       </w:pPr>
       <w:r>
         <w:rPr/>
-        <w:t xml:space="preserve">COS214 Practical </w:t>
-      </w:r>
-      <w:r>
-        <w:rPr/>
-        <w:t>5</w:t>
+        <w:t>COS214 Practical 5</w:t>
       </w:r>
     </w:p>
     <w:p>
@@ -52,11 +48,7 @@
       </w:pPr>
       <w:r>
         <w:rPr/>
-        <w:t>u2510858</w:t>
-      </w:r>
-      <w:r>
-        <w:rPr/>
-        <w:t>2</w:t>
+        <w:t>u25108582</w:t>
       </w:r>
     </w:p>
     <w:p>
@@ -340,7 +332,7 @@
       </w:pPr>
       <w:r>
         <w:rPr/>
-        <w:t>Adapter - PaSystemAdapter</w:t>
+        <w:t>Adapter – PaSystemAdapter</w:t>
       </w:r>
     </w:p>
     <w:p>
@@ -384,29 +376,73 @@
           <w:b w:val="false"/>
           <w:bCs w:val="false"/>
         </w:rPr>
-        <w:t>Facade - C</w:t>
-      </w:r>
-      <w:r>
-        <w:rPr>
-          <w:rFonts w:ascii="Arial;sans-serif" w:hAnsi="Arial;sans-serif"/>
+        <w:t>Fac</w:t>
+      </w:r>
+      <w:r>
+        <w:rPr>
+          <w:rFonts w:eastAsia="Aptos" w:cs="" w:cstheme="minorBidi" w:eastAsiaTheme="minorHAnsi"/>
+          <w:color w:val="auto"/>
+          <w:kern w:val="2"/>
+          <w:sz w:val="24"/>
+          <w:szCs w:val="24"/>
+          <w:lang w:val="en-ZA" w:eastAsia="en-US" w:bidi="ar-SA"/>
+          <w14:ligatures w14:val="standardContextual"/>
+        </w:rPr>
+        <w:t>ade – CampusGuardFacade</w:t>
+      </w:r>
+    </w:p>
+    <w:p>
+      <w:pPr>
+        <w:pStyle w:val="Normal"/>
+        <w:rPr>
           <w:b w:val="false"/>
-          <w:i w:val="false"/>
-          <w:caps w:val="false"/>
-          <w:smallCaps w:val="false"/>
-          <w:strike w:val="false"/>
-          <w:dstrike w:val="false"/>
-          <w:color w:val="000000"/>
-          <w:sz w:val="22"/>
-          <w:u w:val="none"/>
-          <w:effect w:val="none"/>
-          <w:shd w:fill="auto" w:val="clear"/>
-        </w:rPr>
-        <w:t>ampusGuardFacade</w:t>
-      </w:r>
-    </w:p>
-    <w:p>
-      <w:pPr>
-        <w:pStyle w:val="Normal"/>
+        </w:rPr>
+      </w:pPr>
+      <w:r>
+        <w:rPr>
+          <w:rFonts w:eastAsia="Aptos" w:cs="" w:cstheme="minorBidi" w:eastAsiaTheme="minorHAnsi"/>
+          <w:color w:val="auto"/>
+          <w:kern w:val="2"/>
+          <w:sz w:val="24"/>
+          <w:szCs w:val="24"/>
+          <w:lang w:val="en-ZA" w:eastAsia="en-US" w:bidi="ar-SA"/>
+          <w14:ligatures w14:val="standardContextual"/>
+        </w:rPr>
+      </w:r>
+    </w:p>
+    <w:p>
+      <w:pPr>
+        <w:pStyle w:val="Heading4"/>
+        <w:rPr/>
+      </w:pPr>
+      <w:r>
+        <w:rPr/>
+        <w:t>Added Design Patterns</w:t>
+      </w:r>
+    </w:p>
+    <w:p>
+      <w:pPr>
+        <w:pStyle w:val="Normal"/>
+        <w:rPr>
+          <w:b/>
+          <w:bCs/>
+        </w:rPr>
+      </w:pPr>
+      <w:r>
+        <w:rPr>
+          <w:b/>
+          <w:bCs/>
+        </w:rPr>
+        <w:t>State</w:t>
+      </w:r>
+    </w:p>
+    <w:p>
+      <w:pPr>
+        <w:pStyle w:val="Normal"/>
+        <w:numPr>
+          <w:ilvl w:val="0"/>
+          <w:numId w:val="5"/>
+        </w:numPr>
         <w:rPr>
           <w:b w:val="false"/>
           <w:bCs w:val="false"/>
@@ -417,16 +453,62 @@
           <w:b w:val="false"/>
           <w:bCs w:val="false"/>
         </w:rPr>
-      </w:r>
-    </w:p>
-    <w:p>
-      <w:pPr>
-        <w:pStyle w:val="Heading4"/>
-        <w:rPr/>
-      </w:pPr>
-      <w:r>
-        <w:rPr/>
-        <w:t>Added Design Patterns</w:t>
+        <w:t>State – IncidentStatus</w:t>
+      </w:r>
+    </w:p>
+    <w:p>
+      <w:pPr>
+        <w:pStyle w:val="Normal"/>
+        <w:numPr>
+          <w:ilvl w:val="0"/>
+          <w:numId w:val="5"/>
+        </w:numPr>
+        <w:rPr>
+          <w:b w:val="false"/>
+          <w:bCs w:val="false"/>
+        </w:rPr>
+      </w:pPr>
+      <w:r>
+        <w:rPr>
+          <w:b w:val="false"/>
+          <w:bCs w:val="false"/>
+        </w:rPr>
+        <w:t>ConcreteStates – ReportedStatus / EscalatedStatus /DispatchedStatus / ResolvedStatus</w:t>
+      </w:r>
+    </w:p>
+    <w:p>
+      <w:pPr>
+        <w:pStyle w:val="Normal"/>
+        <w:numPr>
+          <w:ilvl w:val="0"/>
+          <w:numId w:val="5"/>
+        </w:numPr>
+        <w:rPr>
+          <w:b w:val="false"/>
+          <w:bCs w:val="false"/>
+        </w:rPr>
+      </w:pPr>
+      <w:r>
+        <w:rPr>
+          <w:b w:val="false"/>
+          <w:bCs w:val="false"/>
+        </w:rPr>
+        <w:t>Context – Incident</w:t>
+      </w:r>
+    </w:p>
+    <w:p>
+      <w:pPr>
+        <w:pStyle w:val="Normal"/>
+        <w:rPr>
+          <w:b w:val="false"/>
+          <w:bCs w:val="false"/>
+        </w:rPr>
+      </w:pPr>
+      <w:r>
+        <w:rPr>
+          <w:b w:val="false"/>
+          <w:bCs w:val="false"/>
+        </w:rPr>
       </w:r>
     </w:p>
     <w:p>
@@ -442,53 +524,67 @@
           <w:b/>
           <w:bCs/>
         </w:rPr>
-        <w:t>State</w:t>
-      </w:r>
-    </w:p>
-    <w:p>
-      <w:pPr>
-        <w:pStyle w:val="Normal"/>
-        <w:rPr>
-          <w:b/>
-          <w:bCs/>
-        </w:rPr>
-      </w:pPr>
-      <w:r>
-        <w:rPr>
-          <w:b/>
-          <w:bCs/>
-        </w:rPr>
-      </w:r>
-    </w:p>
-    <w:p>
-      <w:pPr>
-        <w:pStyle w:val="Normal"/>
-        <w:rPr>
-          <w:b/>
-          <w:bCs/>
-        </w:rPr>
-      </w:pPr>
-      <w:r>
-        <w:rPr>
-          <w:b/>
-          <w:bCs/>
-        </w:rPr>
         <w:t>Strategy</w:t>
       </w:r>
     </w:p>
     <w:p>
       <w:pPr>
         <w:pStyle w:val="Normal"/>
-        <w:rPr>
-          <w:b/>
-          <w:bCs/>
-        </w:rPr>
-      </w:pPr>
-      <w:r>
-        <w:rPr>
-          <w:b/>
-          <w:bCs/>
-        </w:rPr>
+        <w:numPr>
+          <w:ilvl w:val="0"/>
+          <w:numId w:val="6"/>
+        </w:numPr>
+        <w:rPr>
+          <w:b w:val="false"/>
+          <w:bCs w:val="false"/>
+        </w:rPr>
+      </w:pPr>
+      <w:r>
+        <w:rPr>
+          <w:b w:val="false"/>
+          <w:bCs w:val="false"/>
+        </w:rPr>
+        <w:t>Strategy – AccessStrategy</w:t>
+      </w:r>
+    </w:p>
+    <w:p>
+      <w:pPr>
+        <w:pStyle w:val="Normal"/>
+        <w:numPr>
+          <w:ilvl w:val="0"/>
+          <w:numId w:val="6"/>
+        </w:numPr>
+        <w:rPr>
+          <w:b w:val="false"/>
+          <w:bCs w:val="false"/>
+        </w:rPr>
+      </w:pPr>
+      <w:r>
+        <w:rPr>
+          <w:b w:val="false"/>
+          <w:bCs w:val="false"/>
+        </w:rPr>
+        <w:t>ConcreteStrategies – FullLockdownStrategy / PartialLockdownStrategy / EvacuationStrategy</w:t>
+      </w:r>
+    </w:p>
+    <w:p>
+      <w:pPr>
+        <w:pStyle w:val="Normal"/>
+        <w:numPr>
+          <w:ilvl w:val="0"/>
+          <w:numId w:val="6"/>
+        </w:numPr>
+        <w:rPr>
+          <w:b w:val="false"/>
+          <w:bCs w:val="false"/>
+        </w:rPr>
+      </w:pPr>
+      <w:r>
+        <w:rPr>
+          <w:b w:val="false"/>
+          <w:bCs w:val="false"/>
+        </w:rPr>
+        <w:t>Context – Building</w:t>
       </w:r>
     </w:p>
     <w:p>
@@ -498,19 +594,7 @@
       </w:pPr>
       <w:r>
         <w:rPr/>
-        <w:t>Relationships</w:t>
-      </w:r>
-      <w:r>
-        <w:rPr/>
-        <w:t xml:space="preserve"> and Ownership </w:t>
-      </w:r>
-      <w:r>
-        <w:rPr/>
-        <w:t>decisions</w:t>
-      </w:r>
-      <w:r>
-        <w:rPr/>
-        <w:t>:</w:t>
+        <w:t>Relationships and Ownership decisions:</w:t>
       </w:r>
     </w:p>
     <w:p>
@@ -564,19 +648,7 @@
       </w:pPr>
       <w:r>
         <w:rPr/>
-        <w:t>Sequence</w:t>
-      </w:r>
-      <w:r>
-        <w:rPr/>
-        <w:t xml:space="preserve"> Diagram</w:t>
-      </w:r>
-      <w:r>
-        <w:rPr/>
-        <w:t>s</w:t>
-      </w:r>
-      <w:r>
-        <w:rPr/>
-        <w:t>:</w:t>
+        <w:t>Sequence Diagrams:</w:t>
       </w:r>
     </w:p>
     <w:p>
@@ -606,11 +678,7 @@
       </w:pPr>
       <w:r>
         <w:rPr/>
-        <w:t>Behavioural</w:t>
-      </w:r>
-      <w:r>
-        <w:rPr/>
-        <w:t xml:space="preserve"> Diagram: </w:t>
+        <w:t xml:space="preserve">Behavioural Diagram: </w:t>
       </w:r>
     </w:p>
     <w:p>
@@ -629,6 +697,7 @@
     <w:p>
       <w:pPr>
         <w:pStyle w:val="Heading1"/>
+        <w:spacing w:before="0" w:after="80"/>
         <w:rPr/>
       </w:pPr>
       <w:r>
@@ -1256,6 +1325,280 @@
   <w:abstractNum w:abstractNumId="5">
     <w:lvl w:ilvl="0">
       <w:start w:val="1"/>
+      <w:numFmt w:val="bullet"/>
+      <w:lvlText w:val=""/>
+      <w:lvlJc w:val="start"/>
+      <w:pPr>
+        <w:tabs>
+          <w:tab w:val="num" w:pos="720"/>
+        </w:tabs>
+        <w:ind w:start="720" w:hanging="360"/>
+      </w:pPr>
+      <w:rPr>
+        <w:rFonts w:ascii="Symbol" w:hAnsi="Symbol" w:cs="Symbol" w:hint="default"/>
+      </w:rPr>
+    </w:lvl>
+    <w:lvl w:ilvl="1">
+      <w:start w:val="1"/>
+      <w:numFmt w:val="bullet"/>
+      <w:lvlText w:val="◦"/>
+      <w:lvlJc w:val="start"/>
+      <w:pPr>
+        <w:tabs>
+          <w:tab w:val="num" w:pos="1080"/>
+        </w:tabs>
+        <w:ind w:start="1080" w:hanging="360"/>
+      </w:pPr>
+      <w:rPr>
+        <w:rFonts w:ascii="OpenSymbol" w:hAnsi="OpenSymbol" w:cs="OpenSymbol" w:hint="default"/>
+      </w:rPr>
+    </w:lvl>
+    <w:lvl w:ilvl="2">
+      <w:start w:val="1"/>
+      <w:numFmt w:val="bullet"/>
+      <w:lvlText w:val="▪"/>
+      <w:lvlJc w:val="start"/>
+      <w:pPr>
+        <w:tabs>
+          <w:tab w:val="num" w:pos="1440"/>
+        </w:tabs>
+        <w:ind w:start="1440" w:hanging="360"/>
+      </w:pPr>
+      <w:rPr>
+        <w:rFonts w:ascii="OpenSymbol" w:hAnsi="OpenSymbol" w:cs="OpenSymbol" w:hint="default"/>
+      </w:rPr>
+    </w:lvl>
+    <w:lvl w:ilvl="3">
+      <w:start w:val="1"/>
+      <w:numFmt w:val="bullet"/>
+      <w:lvlText w:val=""/>
+      <w:lvlJc w:val="start"/>
+      <w:pPr>
+        <w:tabs>
+          <w:tab w:val="num" w:pos="1800"/>
+        </w:tabs>
+        <w:ind w:start="1800" w:hanging="360"/>
+      </w:pPr>
+      <w:rPr>
+        <w:rFonts w:ascii="Symbol" w:hAnsi="Symbol" w:cs="Symbol" w:hint="default"/>
+      </w:rPr>
+    </w:lvl>
+    <w:lvl w:ilvl="4">
+      <w:start w:val="1"/>
+      <w:numFmt w:val="bullet"/>
+      <w:lvlText w:val="◦"/>
+      <w:lvlJc w:val="start"/>
+      <w:pPr>
+        <w:tabs>
+          <w:tab w:val="num" w:pos="2160"/>
+        </w:tabs>
+        <w:ind w:start="2160" w:hanging="360"/>
+      </w:pPr>
+      <w:rPr>
+        <w:rFonts w:ascii="OpenSymbol" w:hAnsi="OpenSymbol" w:cs="OpenSymbol" w:hint="default"/>
+      </w:rPr>
+    </w:lvl>
+    <w:lvl w:ilvl="5">
+      <w:start w:val="1"/>
+      <w:numFmt w:val="bullet"/>
+      <w:lvlText w:val="▪"/>
+      <w:lvlJc w:val="start"/>
+      <w:pPr>
+        <w:tabs>
+          <w:tab w:val="num" w:pos="2520"/>
+        </w:tabs>
+        <w:ind w:start="2520" w:hanging="360"/>
+      </w:pPr>
+      <w:rPr>
+        <w:rFonts w:ascii="OpenSymbol" w:hAnsi="OpenSymbol" w:cs="OpenSymbol" w:hint="default"/>
+      </w:rPr>
+    </w:lvl>
+    <w:lvl w:ilvl="6">
+      <w:start w:val="1"/>
+      <w:numFmt w:val="bullet"/>
+      <w:lvlText w:val=""/>
+      <w:lvlJc w:val="start"/>
+      <w:pPr>
+        <w:tabs>
+          <w:tab w:val="num" w:pos="2880"/>
+        </w:tabs>
+        <w:ind w:start="2880" w:hanging="360"/>
+      </w:pPr>
+      <w:rPr>
+        <w:rFonts w:ascii="Symbol" w:hAnsi="Symbol" w:cs="Symbol" w:hint="default"/>
+      </w:rPr>
+    </w:lvl>
+    <w:lvl w:ilvl="7">
+      <w:start w:val="1"/>
+      <w:numFmt w:val="bullet"/>
+      <w:lvlText w:val="◦"/>
+      <w:lvlJc w:val="start"/>
+      <w:pPr>
+        <w:tabs>
+          <w:tab w:val="num" w:pos="3240"/>
+        </w:tabs>
+        <w:ind w:start="3240" w:hanging="360"/>
+      </w:pPr>
+      <w:rPr>
+        <w:rFonts w:ascii="OpenSymbol" w:hAnsi="OpenSymbol" w:cs="OpenSymbol" w:hint="default"/>
+      </w:rPr>
+    </w:lvl>
+    <w:lvl w:ilvl="8">
+      <w:start w:val="1"/>
+      <w:numFmt w:val="bullet"/>
+      <w:lvlText w:val="▪"/>
+      <w:lvlJc w:val="start"/>
+      <w:pPr>
+        <w:tabs>
+          <w:tab w:val="num" w:pos="3600"/>
+        </w:tabs>
+        <w:ind w:start="3600" w:hanging="360"/>
+      </w:pPr>
+      <w:rPr>
+        <w:rFonts w:ascii="OpenSymbol" w:hAnsi="OpenSymbol" w:cs="OpenSymbol" w:hint="default"/>
+      </w:rPr>
+    </w:lvl>
+  </w:abstractNum>
+  <w:abstractNum w:abstractNumId="6">
+    <w:lvl w:ilvl="0">
+      <w:start w:val="1"/>
+      <w:numFmt w:val="bullet"/>
+      <w:lvlText w:val=""/>
+      <w:lvlJc w:val="start"/>
+      <w:pPr>
+        <w:tabs>
+          <w:tab w:val="num" w:pos="720"/>
+        </w:tabs>
+        <w:ind w:start="720" w:hanging="360"/>
+      </w:pPr>
+      <w:rPr>
+        <w:rFonts w:ascii="Symbol" w:hAnsi="Symbol" w:cs="Symbol" w:hint="default"/>
+      </w:rPr>
+    </w:lvl>
+    <w:lvl w:ilvl="1">
+      <w:start w:val="1"/>
+      <w:numFmt w:val="bullet"/>
+      <w:lvlText w:val="◦"/>
+      <w:lvlJc w:val="start"/>
+      <w:pPr>
+        <w:tabs>
+          <w:tab w:val="num" w:pos="1080"/>
+        </w:tabs>
+        <w:ind w:start="1080" w:hanging="360"/>
+      </w:pPr>
+      <w:rPr>
+        <w:rFonts w:ascii="OpenSymbol" w:hAnsi="OpenSymbol" w:cs="OpenSymbol" w:hint="default"/>
+      </w:rPr>
+    </w:lvl>
+    <w:lvl w:ilvl="2">
+      <w:start w:val="1"/>
+      <w:numFmt w:val="bullet"/>
+      <w:lvlText w:val="▪"/>
+      <w:lvlJc w:val="start"/>
+      <w:pPr>
+        <w:tabs>
+          <w:tab w:val="num" w:pos="1440"/>
+        </w:tabs>
+        <w:ind w:start="1440" w:hanging="360"/>
+      </w:pPr>
+      <w:rPr>
+        <w:rFonts w:ascii="OpenSymbol" w:hAnsi="OpenSymbol" w:cs="OpenSymbol" w:hint="default"/>
+      </w:rPr>
+    </w:lvl>
+    <w:lvl w:ilvl="3">
+      <w:start w:val="1"/>
+      <w:numFmt w:val="bullet"/>
+      <w:lvlText w:val=""/>
+      <w:lvlJc w:val="start"/>
+      <w:pPr>
+        <w:tabs>
+          <w:tab w:val="num" w:pos="1800"/>
+        </w:tabs>
+        <w:ind w:start="1800" w:hanging="360"/>
+      </w:pPr>
+      <w:rPr>
+        <w:rFonts w:ascii="Symbol" w:hAnsi="Symbol" w:cs="Symbol" w:hint="default"/>
+      </w:rPr>
+    </w:lvl>
+    <w:lvl w:ilvl="4">
+      <w:start w:val="1"/>
+      <w:numFmt w:val="bullet"/>
+      <w:lvlText w:val="◦"/>
+      <w:lvlJc w:val="start"/>
+      <w:pPr>
+        <w:tabs>
+          <w:tab w:val="num" w:pos="2160"/>
+        </w:tabs>
+        <w:ind w:start="2160" w:hanging="360"/>
+      </w:pPr>
+      <w:rPr>
+        <w:rFonts w:ascii="OpenSymbol" w:hAnsi="OpenSymbol" w:cs="OpenSymbol" w:hint="default"/>
+      </w:rPr>
+    </w:lvl>
+    <w:lvl w:ilvl="5">
+      <w:start w:val="1"/>
+      <w:numFmt w:val="bullet"/>
+      <w:lvlText w:val="▪"/>
+      <w:lvlJc w:val="start"/>
+      <w:pPr>
+        <w:tabs>
+          <w:tab w:val="num" w:pos="2520"/>
+        </w:tabs>
+        <w:ind w:start="2520" w:hanging="360"/>
+      </w:pPr>
+      <w:rPr>
+        <w:rFonts w:ascii="OpenSymbol" w:hAnsi="OpenSymbol" w:cs="OpenSymbol" w:hint="default"/>
+      </w:rPr>
+    </w:lvl>
+    <w:lvl w:ilvl="6">
+      <w:start w:val="1"/>
+      <w:numFmt w:val="bullet"/>
+      <w:lvlText w:val=""/>
+      <w:lvlJc w:val="start"/>
+      <w:pPr>
+        <w:tabs>
+          <w:tab w:val="num" w:pos="2880"/>
+        </w:tabs>
+        <w:ind w:start="2880" w:hanging="360"/>
+      </w:pPr>
+      <w:rPr>
+        <w:rFonts w:ascii="Symbol" w:hAnsi="Symbol" w:cs="Symbol" w:hint="default"/>
+      </w:rPr>
+    </w:lvl>
+    <w:lvl w:ilvl="7">
+      <w:start w:val="1"/>
+      <w:numFmt w:val="bullet"/>
+      <w:lvlText w:val="◦"/>
+      <w:lvlJc w:val="start"/>
+      <w:pPr>
+        <w:tabs>
+          <w:tab w:val="num" w:pos="3240"/>
+        </w:tabs>
+        <w:ind w:start="3240" w:hanging="360"/>
+      </w:pPr>
+      <w:rPr>
+        <w:rFonts w:ascii="OpenSymbol" w:hAnsi="OpenSymbol" w:cs="OpenSymbol" w:hint="default"/>
+      </w:rPr>
+    </w:lvl>
+    <w:lvl w:ilvl="8">
+      <w:start w:val="1"/>
+      <w:numFmt w:val="bullet"/>
+      <w:lvlText w:val="▪"/>
+      <w:lvlJc w:val="start"/>
+      <w:pPr>
+        <w:tabs>
+          <w:tab w:val="num" w:pos="3600"/>
+        </w:tabs>
+        <w:ind w:start="3600" w:hanging="360"/>
+      </w:pPr>
+      <w:rPr>
+        <w:rFonts w:ascii="OpenSymbol" w:hAnsi="OpenSymbol" w:cs="OpenSymbol" w:hint="default"/>
+      </w:rPr>
+    </w:lvl>
+  </w:abstractNum>
+  <w:abstractNum w:abstractNumId="7">
+    <w:lvl w:ilvl="0">
+      <w:start w:val="1"/>
       <w:numFmt w:val="none"/>
       <w:suff w:val="nothing"/>
       <w:lvlText w:val=""/>
@@ -1386,6 +1729,12 @@
   </w:num>
   <w:num w:numId="5">
     <w:abstractNumId w:val="5"/>
+  </w:num>
+  <w:num w:numId="6">
+    <w:abstractNumId w:val="6"/>
+  </w:num>
+  <w:num w:numId="7">
+    <w:abstractNumId w:val="7"/>
   </w:num>
 </w:numbering>
 </file>
@@ -2222,8 +2571,8 @@
       <w:spacing w:val="5"/>
     </w:rPr>
   </w:style>
-  <w:style w:type="character" w:styleId="Bulletsuser" w:customStyle="1">
-    <w:name w:val="Bullets (user)"/>
+  <w:style w:type="character" w:styleId="Bullets" w:customStyle="1">
+    <w:name w:val="Bullets"/>
     <w:qFormat/>
     <w:rPr>
       <w:rFonts w:ascii="OpenSymbol" w:hAnsi="OpenSymbol" w:eastAsia="OpenSymbol" w:cs="OpenSymbol"/>
@@ -2253,8 +2602,8 @@
       <w:shd w:fill="E1DFDD" w:val="clear"/>
     </w:rPr>
   </w:style>
-  <w:style w:type="character" w:styleId="Bullets">
-    <w:name w:val="Bullets"/>
+  <w:style w:type="character" w:styleId="Bulletsuser">
+    <w:name w:val="Bullets (user)"/>
     <w:qFormat/>
     <w:rPr>
       <w:rFonts w:ascii="OpenSymbol" w:hAnsi="OpenSymbol" w:eastAsia="OpenSymbol" w:cs="OpenSymbol"/>

</xml_diff>

<commit_message>
Added valgrind image to PDF
</commit_message>
<xml_diff>
--- a/Practical5.docx
+++ b/Practical5.docx
@@ -776,6 +776,12 @@
           </wp:inline>
         </w:drawing>
       </w:r>
+    </w:p>
+    <w:p>
+      <w:pPr>
+        <w:pStyle w:val="Heading2"/>
+        <w:rPr/>
+      </w:pPr>
       <w:r>
         <w:rPr/>
         <w:t>GDB and Valgrind</w:t>
@@ -788,7 +794,52 @@
       </w:pPr>
       <w:r>
         <w:rPr/>
-        <w:t>.</w:t>
+        <w:drawing>
+          <wp:anchor distT="0" distB="0" distL="0" distR="0" simplePos="0" relativeHeight="6" behindDoc="0" locked="0" layoutInCell="0" allowOverlap="1">
+            <wp:simplePos x="0" y="0"/>
+            <wp:positionH relativeFrom="column">
+              <wp:align>center</wp:align>
+            </wp:positionH>
+            <wp:positionV relativeFrom="paragraph">
+              <wp:posOffset>635</wp:posOffset>
+            </wp:positionV>
+            <wp:extent cx="5731510" cy="2473325"/>
+            <wp:effectExtent l="0" t="0" r="0" b="0"/>
+            <wp:wrapSquare wrapText="largest"/>
+            <wp:docPr id="5" name="Image4"/>
+            <wp:cNvGraphicFramePr>
+              <a:graphicFrameLocks xmlns:a="http://schemas.openxmlformats.org/drawingml/2006/main" noChangeAspect="1"/>
+            </wp:cNvGraphicFramePr>
+            <a:graphic xmlns:a="http://schemas.openxmlformats.org/drawingml/2006/main">
+              <a:graphicData uri="http://schemas.openxmlformats.org/drawingml/2006/picture">
+                <pic:pic xmlns:pic="http://schemas.openxmlformats.org/drawingml/2006/picture">
+                  <pic:nvPicPr>
+                    <pic:cNvPr id="5" name="Image4"/>
+                    <pic:cNvPicPr>
+                      <a:picLocks noChangeAspect="1" noChangeArrowheads="1"/>
+                    </pic:cNvPicPr>
+                  </pic:nvPicPr>
+                  <pic:blipFill>
+                    <a:blip r:embed="rId6"/>
+                    <a:stretch>
+                      <a:fillRect/>
+                    </a:stretch>
+                  </pic:blipFill>
+                  <pic:spPr bwMode="auto">
+                    <a:xfrm>
+                      <a:off x="0" y="0"/>
+                      <a:ext cx="5731510" cy="2473325"/>
+                    </a:xfrm>
+                    <a:prstGeom prst="rect">
+                      <a:avLst/>
+                    </a:prstGeom>
+                    <a:noFill/>
+                  </pic:spPr>
+                </pic:pic>
+              </a:graphicData>
+            </a:graphic>
+          </wp:anchor>
+        </w:drawing>
       </w:r>
     </w:p>
     <w:p>
@@ -806,7 +857,7 @@
         <w:pStyle w:val="Normal"/>
         <w:rPr/>
       </w:pPr>
-      <w:hyperlink r:id="rId6">
+      <w:hyperlink r:id="rId7">
         <w:r>
           <w:rPr>
             <w:rStyle w:val="Hyperlink"/>
@@ -818,15 +869,6 @@
     <w:p>
       <w:pPr>
         <w:pStyle w:val="Normal"/>
-        <w:rPr/>
-      </w:pPr>
-      <w:r>
-        <w:rPr/>
-      </w:r>
-    </w:p>
-    <w:p>
-      <w:pPr>
-        <w:pStyle w:val="Normal"/>
         <w:widowControl/>
         <w:suppressAutoHyphens w:val="true"/>
         <w:bidi w:val="0"/>
@@ -836,7 +878,6 @@
       </w:pPr>
       <w:r>
         <w:rPr/>
-        <w:t>(collaboration &amp; contribution statement)</w:t>
       </w:r>
     </w:p>
     <w:sectPr>

</xml_diff>

<commit_message>
Added design pattern justification
</commit_message>
<xml_diff>
--- a/Practical5.docx
+++ b/Practical5.docx
@@ -553,6 +553,74 @@
       <w:r>
         <w:rPr/>
         <w:t>Context – Building</w:t>
+      </w:r>
+    </w:p>
+    <w:p>
+      <w:pPr>
+        <w:pStyle w:val="Normal"/>
+        <w:rPr/>
+      </w:pPr>
+      <w:r>
+        <w:rPr/>
+      </w:r>
+    </w:p>
+    <w:p>
+      <w:pPr>
+        <w:pStyle w:val="Heading4"/>
+        <w:rPr/>
+      </w:pPr>
+      <w:r>
+        <w:rPr/>
+        <w:t>Justification</w:t>
+      </w:r>
+    </w:p>
+    <w:p>
+      <w:pPr>
+        <w:pStyle w:val="Normal"/>
+        <w:rPr/>
+      </w:pPr>
+      <w:r>
+        <w:rPr/>
+        <w:t>Incidents will have a process in which they are handled. State pattern allows for ‘phases’ (ReportedStatus, EscalatedStatus, DispatchedStatus, ResolvedStatus) and the operations to differ based on what phase it is in.</w:t>
+      </w:r>
+    </w:p>
+    <w:p>
+      <w:pPr>
+        <w:pStyle w:val="Normal"/>
+        <w:rPr/>
+      </w:pPr>
+      <w:r>
+        <w:rPr/>
+        <w:t>Better than having a nested if/else or a switch statement, allows for new concretestates being added without modifying the existing Incident class.</w:t>
+      </w:r>
+    </w:p>
+    <w:p>
+      <w:pPr>
+        <w:pStyle w:val="Normal"/>
+        <w:rPr/>
+      </w:pPr>
+      <w:r>
+        <w:rPr/>
+      </w:r>
+    </w:p>
+    <w:p>
+      <w:pPr>
+        <w:pStyle w:val="Normal"/>
+        <w:rPr/>
+      </w:pPr>
+      <w:r>
+        <w:rPr/>
+        <w:t>Different scenarios will need different access types for access to a Building. How each of these are handled can easily be descibed by each concreteStrategy.</w:t>
+      </w:r>
+    </w:p>
+    <w:p>
+      <w:pPr>
+        <w:pStyle w:val="Normal"/>
+        <w:rPr/>
+      </w:pPr>
+      <w:r>
+        <w:rPr/>
+        <w:t>Strategy pattern can be dynamically changed at runtime, and new saftey protocols can be easily added/implemented at a later time.</w:t>
       </w:r>
     </w:p>
     <w:p>
@@ -2692,8 +2760,8 @@
       <w:spacing w:val="5"/>
     </w:rPr>
   </w:style>
-  <w:style w:type="character" w:styleId="Bulletsuser" w:customStyle="1">
-    <w:name w:val="Bullets (user)"/>
+  <w:style w:type="character" w:styleId="Bullets" w:customStyle="1">
+    <w:name w:val="Bullets"/>
     <w:qFormat/>
     <w:rPr>
       <w:rFonts w:ascii="OpenSymbol" w:hAnsi="OpenSymbol" w:eastAsia="OpenSymbol" w:cs="OpenSymbol"/>
@@ -2723,8 +2791,8 @@
       <w:shd w:fill="E1DFDD" w:val="clear"/>
     </w:rPr>
   </w:style>
-  <w:style w:type="character" w:styleId="Bullets" w:customStyle="1">
-    <w:name w:val="Bullets"/>
+  <w:style w:type="character" w:styleId="Bulletsuser" w:customStyle="1">
+    <w:name w:val="Bullets (user)"/>
     <w:qFormat/>
     <w:rPr>
       <w:rFonts w:ascii="OpenSymbol" w:hAnsi="OpenSymbol" w:eastAsia="OpenSymbol" w:cs="OpenSymbol"/>

</xml_diff>